<commit_message>
Respondimos la Prac 2
</commit_message>
<xml_diff>
--- a/SC_LAB_002_Manual_Alumno_Secure_SDLC.docx
+++ b/SC_LAB_002_Manual_Alumno_Secure_SDLC.docx
@@ -360,7 +360,9 @@
             </w:tcMar>
           </w:tcPr>
           <w:p>
-            <w:r/>
+            <w:r>
+              <w:t>Escribir el alcance como una regla de negocio explícita y verificable: "un estudiante consulta únicamente las calificaciones asociadas a su propia matrícula; cualquier otra solicitud se rechaza con 403". Definir también qué roles pueden ver calificaciones ajenas y bajo qué relación (profesor del grupo, en el periodo vigente).</w:t>
+            </w:r>
             <w:r>
               <w:rPr>
                 <w:b w:val="0"/>
@@ -382,7 +384,9 @@
             </w:tcMar>
           </w:tcPr>
           <w:p>
-            <w:r/>
+            <w:r>
+              <w:t>Criterio de aceptación de seguridad en la historia de usuario, con su caso negativo redactado. Evidencia: la historia en el backlog contiene el caso "acceso a matrícula ajena → 403".</w:t>
+            </w:r>
             <w:r>
               <w:rPr>
                 <w:b w:val="0"/>
@@ -429,7 +433,9 @@
             </w:tcMar>
           </w:tcPr>
           <w:p>
-            <w:r/>
+            <w:r>
+              <w:t>Decidir que el acceso a calificaciones se resuelve por la relación usuario↔recurso y no por el rol. Modelar la consulta como "dame las calificaciones de este alumno para este solicitante", de modo que no exista una firma que permita pedir un registro sin decir quién lo pide. Sustituir identificadores secuenciales por identificadores opacos como defensa en profundidad.</w:t>
+            </w:r>
             <w:r>
               <w:rPr>
                 <w:b w:val="0"/>
@@ -451,7 +457,9 @@
             </w:tcMar>
           </w:tcPr>
           <w:p>
-            <w:r/>
+            <w:r>
+              <w:t>Diagrama de flujo de autorización y modelo de datos con la relación explícita. Decisión de arquitectura registrada (ADR). Evidencia: el diseño no contiene ningún camino de lectura que omita el contexto del solicitante.</w:t>
+            </w:r>
             <w:r>
               <w:rPr>
                 <w:b w:val="0"/>
@@ -498,7 +506,9 @@
             </w:tcMar>
           </w:tcPr>
           <w:p>
-            <w:r/>
+            <w:r>
+              <w:t>Implementar la verificación en el servidor y en cada petición, dentro de la capa de acceso a datos y no en cada controlador. Aplicar deny by default. Prohibir en revisión de código cualquier consulta que reciba un identificador del cliente y lo use sin filtrar por el usuario de la sesión.</w:t>
+            </w:r>
             <w:r>
               <w:rPr>
                 <w:b w:val="0"/>
@@ -520,7 +530,9 @@
             </w:tcMar>
           </w:tcPr>
           <w:p>
-            <w:r/>
+            <w:r>
+              <w:t>Código de la capa de autorización + checklist de revisión de PR con el punto "¿esta consulta filtra por el usuario de la sesión?". Evidencia: el PR con la verificación y su revisión aprobada.</w:t>
+            </w:r>
             <w:r>
               <w:rPr>
                 <w:b w:val="0"/>
@@ -567,7 +579,9 @@
             </w:tcMar>
           </w:tcPr>
           <w:p>
-            <w:r/>
+            <w:r>
+              <w:t>Escribir pruebas automatizadas del caso negativo, no solo del feliz: el estudiante A pide las calificaciones de B y debe recibir 403. Incluir la variante de enumeración (recorrer un rango de identificadores) y la prueba del rol profesor sobre un grupo ajeno. Integrarlas al pipeline para que un futuro cambio que rompa la regla haga fallar la build.</w:t>
+            </w:r>
             <w:r>
               <w:rPr>
                 <w:b w:val="0"/>
@@ -589,7 +603,9 @@
             </w:tcMar>
           </w:tcPr>
           <w:p>
-            <w:r/>
+            <w:r>
+              <w:t>Suite de pruebas de autorización en CI. Evidencia: el reporte del pipeline mostrando las pruebas negativas en verde, y la build roja cuando se desactiva la verificación a propósito.</w:t>
+            </w:r>
             <w:r>
               <w:rPr>
                 <w:b w:val="0"/>
@@ -636,7 +652,9 @@
             </w:tcMar>
           </w:tcPr>
           <w:p>
-            <w:r/>
+            <w:r>
+              <w:t>Endurecer el entorno para que un fallo no se amplifique: errores genéricos sin trazas ni detalles de la consulta, desactivar el modo depuración, HTTPS obligatorio con HSTS, cabeceras de seguridad, y separación real entre datos de prueba y datos reales. Verificar que la configuración de producción no relaje la política de autorización.</w:t>
+            </w:r>
             <w:r>
               <w:rPr>
                 <w:b w:val="0"/>
@@ -658,7 +676,9 @@
             </w:tcMar>
           </w:tcPr>
           <w:p>
-            <w:r/>
+            <w:r>
+              <w:t>Configuración de producción versionada (infraestructura como código) y checklist de endurecimiento firmado. Evidencia: el archivo de configuración en el repositorio y el resultado del escaneo de configuración.</w:t>
+            </w:r>
             <w:r>
               <w:rPr>
                 <w:b w:val="0"/>
@@ -705,7 +725,9 @@
             </w:tcMar>
           </w:tcPr>
           <w:p>
-            <w:r/>
+            <w:r>
+              <w:t>Registrar cada acceso denegado y alertar ante ráfagas de 403 de un mismo usuario o de un mismo origen — es la firma de alguien enumerando. Revisar periódicamente los logs, mantener la suite de pruebas viva cuando el módulo cambie, y definir un procedimiento de respuesta si se confirma una fuga.</w:t>
+            </w:r>
             <w:r>
               <w:rPr>
                 <w:b w:val="0"/>
@@ -727,7 +749,9 @@
             </w:tcMar>
           </w:tcPr>
           <w:p>
-            <w:r/>
+            <w:r>
+              <w:t>Log append-only de accesos denegados, regla de alerta configurada y bitácora de revisión. Evidencia: captura de la alerta disparándose en una prueba controlada.</w:t>
+            </w:r>
             <w:r>
               <w:rPr>
                 <w:b w:val="0"/>
@@ -1228,7 +1252,9 @@
             </w:tcMar>
           </w:tcPr>
           <w:p>
-            <w:r/>
+            <w:r>
+              <w:t>🟢 Temprano. Regla de propiedad del documento; prohibir directorio público.</w:t>
+            </w:r>
             <w:r>
               <w:rPr>
                 <w:b w:val="0"/>
@@ -1250,7 +1276,9 @@
             </w:tcMar>
           </w:tcPr>
           <w:p>
-            <w:r/>
+            <w:r>
+              <w:t>Entrega mediada desde almacén privado; nombres de archivo aleatorios.</w:t>
+            </w:r>
             <w:r>
               <w:rPr>
                 <w:b w:val="0"/>
@@ -1272,7 +1300,9 @@
             </w:tcMar>
           </w:tcPr>
           <w:p>
-            <w:r/>
+            <w:r>
+              <w:t>Verificación de propiedad, magic bytes, límite de tamaño y cuota.</w:t>
+            </w:r>
             <w:r>
               <w:rPr>
                 <w:b w:val="0"/>
@@ -1294,7 +1324,9 @@
             </w:tcMar>
           </w:tcPr>
           <w:p>
-            <w:r/>
+            <w:r>
+              <w:t>Negativas: descarga ajena (403), ruta directa (404), ejecutable renombrado, límites.</w:t>
+            </w:r>
             <w:r>
               <w:rPr>
                 <w:b w:val="0"/>
@@ -1316,7 +1348,9 @@
             </w:tcMar>
           </w:tcPr>
           <w:p>
-            <w:r/>
+            <w:r>
+              <w:t>Servidor no publica el directorio; permisos restrictivos; antivirus activo.</w:t>
+            </w:r>
             <w:r>
               <w:rPr>
                 <w:b w:val="0"/>
@@ -1338,7 +1372,9 @@
             </w:tcMar>
           </w:tcPr>
           <w:p>
-            <w:r/>
+            <w:r>
+              <w:t>🔵 Posterior. Log de descargas y alertas; reescaneo antivirus periódico.</w:t>
+            </w:r>
             <w:r>
               <w:rPr>
                 <w:b w:val="0"/>
@@ -1385,7 +1421,9 @@
             </w:tcMar>
           </w:tcPr>
           <w:p>
-            <w:r/>
+            <w:r>
+              <w:t>🟢 Temprano. Política de gestión de secretos: ningún secreto en el repo.</w:t>
+            </w:r>
             <w:r>
               <w:rPr>
                 <w:b w:val="0"/>
@@ -1407,7 +1445,9 @@
             </w:tcMar>
           </w:tcPr>
           <w:p>
-            <w:r/>
+            <w:r>
+              <w:t>Config. separada del código; falla ruidosa si falta variable obligatoria.</w:t>
+            </w:r>
             <w:r>
               <w:rPr>
                 <w:b w:val="0"/>
@@ -1429,7 +1469,9 @@
             </w:tcMar>
           </w:tcPr>
           <w:p>
-            <w:r/>
+            <w:r>
+              <w:t>🟢 Temprano. .gitignore desde el primer commit + hook de pre-commit.</w:t>
+            </w:r>
             <w:r>
               <w:rPr>
                 <w:b w:val="0"/>
@@ -1451,7 +1493,9 @@
             </w:tcMar>
           </w:tcPr>
           <w:p>
-            <w:r/>
+            <w:r>
+              <w:t>Escaneo de secretos en el pipeline sobre el historial completo.</w:t>
+            </w:r>
             <w:r>
               <w:rPr>
                 <w:b w:val="0"/>
@@ -1473,7 +1517,9 @@
             </w:tcMar>
           </w:tcPr>
           <w:p>
-            <w:r/>
+            <w:r>
+              <w:t>Secretos desde gestor de la plataforma; permisos mínimos, caducidad corta.</w:t>
+            </w:r>
             <w:r>
               <w:rPr>
                 <w:b w:val="0"/>
@@ -1495,7 +1541,9 @@
             </w:tcMar>
           </w:tcPr>
           <w:p>
-            <w:r/>
+            <w:r>
+              <w:t>🔵 Posterior. Monitoreo de uso, rotación periódica, respuesta a exposición.</w:t>
+            </w:r>
             <w:r>
               <w:rPr>
                 <w:b w:val="0"/>
@@ -1542,7 +1590,9 @@
             </w:tcMar>
           </w:tcPr>
           <w:p>
-            <w:r/>
+            <w:r>
+              <w:t>🟢 Temprano. Regla profesor↔grupo↔periodo vigente; estados borrador/publicado.</w:t>
+            </w:r>
             <w:r>
               <w:rPr>
                 <w:b w:val="0"/>
@@ -1564,7 +1614,9 @@
             </w:tcMar>
           </w:tcPr>
           <w:p>
-            <w:r/>
+            <w:r>
+              <w:t>Relación profesor↔grupo↔periodo como fuente de autorización; historial append-only.</w:t>
+            </w:r>
             <w:r>
               <w:rPr>
                 <w:b w:val="0"/>
@@ -1586,7 +1638,9 @@
             </w:tcMar>
           </w:tcPr>
           <w:p>
-            <w:r/>
+            <w:r>
+              <w:t>Validar asignación vigente en cada escritura; auditoría en la misma transacción.</w:t>
+            </w:r>
             <w:r>
               <w:rPr>
                 <w:b w:val="0"/>
@@ -1608,7 +1662,9 @@
             </w:tcMar>
           </w:tcPr>
           <w:p>
-            <w:r/>
+            <w:r>
+              <w:t>Negativas por grupo/periodo ajeno y publicación; verificar registro en bitácora.</w:t>
+            </w:r>
             <w:r>
               <w:rPr>
                 <w:b w:val="0"/>
@@ -1630,7 +1686,9 @@
             </w:tcMar>
           </w:tcPr>
           <w:p>
-            <w:r/>
+            <w:r>
+              <w:t>Bitácora insert-only; respaldos con retención; sincronización horaria.</w:t>
+            </w:r>
             <w:r>
               <w:rPr>
                 <w:b w:val="0"/>
@@ -1652,7 +1710,9 @@
             </w:tcMar>
           </w:tcPr>
           <w:p>
-            <w:r/>
+            <w:r>
+              <w:t>🔵 Posterior. Notificar al estudiante; revisión periódica y alertas.</w:t>
+            </w:r>
             <w:r>
               <w:rPr>
                 <w:b w:val="0"/>
@@ -1699,7 +1759,9 @@
             </w:tcMar>
           </w:tcPr>
           <w:p>
-            <w:r/>
+            <w:r>
+              <w:t>🟢 Temprano. Política de autenticación medible: umbral, MFA, contraseñas.</w:t>
+            </w:r>
             <w:r>
               <w:rPr>
                 <w:b w:val="0"/>
@@ -1721,7 +1783,9 @@
             </w:tcMar>
           </w:tcPr>
           <w:p>
-            <w:r/>
+            <w:r>
+              <w:t>Componente con contador por cuenta/IP; hash lento (Argon2id/bcrypt); rotación de sesión.</w:t>
+            </w:r>
             <w:r>
               <w:rPr>
                 <w:b w:val="0"/>
@@ -1743,7 +1807,9 @@
             </w:tcMar>
           </w:tcPr>
           <w:p>
-            <w:r/>
+            <w:r>
+              <w:t>Rate limiting, retardo progresivo, CAPTCHA; respuesta y tiempo uniformes.</w:t>
+            </w:r>
             <w:r>
               <w:rPr>
                 <w:b w:val="0"/>
@@ -1765,7 +1831,9 @@
             </w:tcMar>
           </w:tcPr>
           <w:p>
-            <w:r/>
+            <w:r>
+              <w:t>Simular 100 intentos; verificar bloqueo, mensaje uniforme, falsos positivos.</w:t>
+            </w:r>
             <w:r>
               <w:rPr>
                 <w:b w:val="0"/>
@@ -1787,7 +1855,9 @@
             </w:tcMar>
           </w:tcPr>
           <w:p>
-            <w:r/>
+            <w:r>
+              <w:t>Rate limiting también en el borde (WAF); registrar IP real tras el proxy.</w:t>
+            </w:r>
             <w:r>
               <w:rPr>
                 <w:b w:val="0"/>
@@ -1809,7 +1879,9 @@
             </w:tcMar>
           </w:tcPr>
           <w:p>
-            <w:r/>
+            <w:r>
+              <w:t>🔵 Posterior. Alertar ráfagas; notificar accesos inusuales; procedimiento de respuesta.</w:t>
+            </w:r>
             <w:r>
               <w:rPr>
                 <w:b w:val="0"/>
@@ -1933,14 +2005,15 @@
             </w:tcMar>
           </w:tcPr>
           <w:p>
-            <w:r/>
+            <w:r>
+              <w:t>1. El acceso a datos pasa obligatoriamente por una capa que recibe quién pide junto con qué pide; no existe una firma de consulta que acepte solo el identificador.</w:t>
+            </w:r>
             <w:r>
               <w:rPr>
                 <w:b w:val="0"/>
                 <w:color w:val="1F2937"/>
                 <w:sz w:val="16"/>
               </w:rPr>
-              <w:t>1</w:t>
             </w:r>
           </w:p>
         </w:tc>
@@ -1956,7 +2029,9 @@
             </w:tcMar>
           </w:tcPr>
           <w:p>
-            <w:r/>
+            <w:r>
+              <w:t>Security by Design</w:t>
+            </w:r>
             <w:r>
               <w:rPr>
                 <w:b w:val="0"/>
@@ -1978,7 +2053,9 @@
             </w:tcMar>
           </w:tcPr>
           <w:p>
-            <w:r/>
+            <w:r>
+              <w:t>No es una validación agregada: es la estructura la que impide expresar el acceso inseguro. Un desarrollador no puede omitir la verificación porque el código no compila sin el contexto del solicitante. Si fuera by default, el acceso sin verificar seguiría siendo escribible y solo estaría desactivado de origen — la diferencia es entre "no se puede" y "viene apagado".</w:t>
+            </w:r>
             <w:r>
               <w:rPr>
                 <w:b w:val="0"/>
@@ -2002,14 +2079,15 @@
             </w:tcMar>
           </w:tcPr>
           <w:p>
-            <w:r/>
+            <w:r>
+              <w:t>2. Un endpoint sin regla de autorización declarada responde 403 (deny by default).</w:t>
+            </w:r>
             <w:r>
               <w:rPr>
                 <w:b w:val="0"/>
                 <w:color w:val="1F2937"/>
                 <w:sz w:val="16"/>
               </w:rPr>
-              <w:t>2</w:t>
             </w:r>
           </w:p>
         </w:tc>
@@ -2025,7 +2103,9 @@
             </w:tcMar>
           </w:tcPr>
           <w:p>
-            <w:r/>
+            <w:r>
+              <w:t>Security by Default</w:t>
+            </w:r>
             <w:r>
               <w:rPr>
                 <w:b w:val="0"/>
@@ -2047,7 +2127,9 @@
             </w:tcMar>
           </w:tcPr>
           <w:p>
-            <w:r/>
+            <w:r>
+              <w:t>El sistema sí admite configurar mal un endpoint; lo que garantiza el default es que la ausencia de decisión caiga del lado seguro. Protege contra el olvido, que es el modo real en que estos fallos llegan a producción, no contra una decisión equivocada. Por eso es by default y no by design.</w:t>
+            </w:r>
             <w:r>
               <w:rPr>
                 <w:b w:val="0"/>

</xml_diff>